<commit_message>
docs: loc bo cac prompt sua loi adhoc, chuan hoa 14 prompt xay dung tinh nang
</commit_message>
<xml_diff>
--- a/docs/HUONG_DAN_XAY_DUNG_VA_KIEN_TRUC_UNG_DUNG.docx
+++ b/docs/HUONG_DAN_XAY_DUNG_VA_KIEN_TRUC_UNG_DUNG.docx
@@ -2435,7 +2435,7 @@
                 <w:color w:val="1B365D"/>
                 <w:sz w:val="17"/>
               </w:rPr>
-              <w:t>Giai doan 1: Khoi tao du an</w:t>
+              <w:t>1. Khoi tao kien truc</w:t>
             </w:r>
           </w:p>
         </w:tc>
@@ -2499,7 +2499,135 @@
                 <w:color w:val="1B365D"/>
                 <w:sz w:val="17"/>
               </w:rPr>
-              <w:t>Giai doan 2: Bao mat phan quyen kep</w:t>
+              <w:t>2. CSDL &amp; Mo hinh chuoi</w:t>
+            </w:r>
+          </w:p>
+        </w:tc>
+        <w:tc>
+          <w:tcPr>
+            <w:tcW w:type="dxa" w:w="3600"/>
+            <w:shd w:fill="F8F9FA"/>
+            <w:tcMar>
+              <w:top w:w="50" w:type="dxa"/>
+              <w:bottom w:w="50" w:type="dxa"/>
+              <w:left w:w="80" w:type="dxa"/>
+              <w:right w:w="80" w:type="dxa"/>
+            </w:tcMar>
+          </w:tcPr>
+          <w:p>
+            <w:r>
+              <w:rPr>
+                <w:sz w:val="17"/>
+              </w:rPr>
+              <w:t>Thiet ke cac Entity JPA cho mo hinh chuoi hoa tuoi: Store, Product, StoreInventory voi so luong ton kho theo chi nhanh va khoa phuc hop.</w:t>
+            </w:r>
+          </w:p>
+        </w:tc>
+        <w:tc>
+          <w:tcPr>
+            <w:tcW w:type="dxa" w:w="3600"/>
+            <w:shd w:fill="F8F9FA"/>
+            <w:tcMar>
+              <w:top w:w="50" w:type="dxa"/>
+              <w:bottom w:w="50" w:type="dxa"/>
+              <w:left w:w="80" w:type="dxa"/>
+              <w:right w:w="80" w:type="dxa"/>
+            </w:tcMar>
+          </w:tcPr>
+          <w:p>
+            <w:r>
+              <w:rPr>
+                <w:sz w:val="17"/>
+              </w:rPr>
+              <w:t>AI thiet ke cac entity quan he, tao bang store_inventories lien ket @ManyToOne voi Store va Product luu so luong quantity.</w:t>
+            </w:r>
+          </w:p>
+        </w:tc>
+      </w:tr>
+      <w:tr>
+        <w:tc>
+          <w:tcPr>
+            <w:tcW w:type="dxa" w:w="2160"/>
+            <w:shd w:fill="FFFFFF"/>
+            <w:tcMar>
+              <w:top w:w="50" w:type="dxa"/>
+              <w:bottom w:w="50" w:type="dxa"/>
+              <w:left w:w="80" w:type="dxa"/>
+              <w:right w:w="80" w:type="dxa"/>
+            </w:tcMar>
+          </w:tcPr>
+          <w:p>
+            <w:r>
+              <w:rPr>
+                <w:b/>
+                <w:color w:val="1B365D"/>
+                <w:sz w:val="17"/>
+              </w:rPr>
+              <w:t>3. Migration CSDL Flyway</w:t>
+            </w:r>
+          </w:p>
+        </w:tc>
+        <w:tc>
+          <w:tcPr>
+            <w:tcW w:type="dxa" w:w="3600"/>
+            <w:shd w:fill="FFFFFF"/>
+            <w:tcMar>
+              <w:top w:w="50" w:type="dxa"/>
+              <w:bottom w:w="50" w:type="dxa"/>
+              <w:left w:w="80" w:type="dxa"/>
+              <w:right w:w="80" w:type="dxa"/>
+            </w:tcMar>
+          </w:tcPr>
+          <w:p>
+            <w:r>
+              <w:rPr>
+                <w:sz w:val="17"/>
+              </w:rPr>
+              <w:t>Cau hinh Flyway migration tren SQL Server tu V1 den V8, tat ddl-auto cua Hibernate de kiem soat chat che schema dbo.</w:t>
+            </w:r>
+          </w:p>
+        </w:tc>
+        <w:tc>
+          <w:tcPr>
+            <w:tcW w:type="dxa" w:w="3600"/>
+            <w:shd w:fill="FFFFFF"/>
+            <w:tcMar>
+              <w:top w:w="50" w:type="dxa"/>
+              <w:bottom w:w="50" w:type="dxa"/>
+              <w:left w:w="80" w:type="dxa"/>
+              <w:right w:w="80" w:type="dxa"/>
+            </w:tcMar>
+          </w:tcPr>
+          <w:p>
+            <w:r>
+              <w:rPr>
+                <w:sz w:val="17"/>
+              </w:rPr>
+              <w:t>AI sinh 8 ban migration SQL trong resources/db/migration/sqlserver, tat hoan toan ddl-auto cua Hibernate.</w:t>
+            </w:r>
+          </w:p>
+        </w:tc>
+      </w:tr>
+      <w:tr>
+        <w:tc>
+          <w:tcPr>
+            <w:tcW w:type="dxa" w:w="2160"/>
+            <w:shd w:fill="F8F9FA"/>
+            <w:tcMar>
+              <w:top w:w="50" w:type="dxa"/>
+              <w:bottom w:w="50" w:type="dxa"/>
+              <w:left w:w="80" w:type="dxa"/>
+              <w:right w:w="80" w:type="dxa"/>
+            </w:tcMar>
+          </w:tcPr>
+          <w:p>
+            <w:r>
+              <w:rPr>
+                <w:b/>
+                <w:color w:val="1B365D"/>
+                <w:sz w:val="17"/>
+              </w:rPr>
+              <w:t>4. Bao mat phan quyen kep</w:t>
             </w:r>
           </w:p>
         </w:tc>
@@ -2563,7 +2691,7 @@
                 <w:color w:val="1B365D"/>
                 <w:sz w:val="17"/>
               </w:rPr>
-              <w:t>Giai doan 3: Dat hang &amp; Tru ton kho</w:t>
+              <w:t>5. Cap phat &amp; Xoay JWT</w:t>
             </w:r>
           </w:p>
         </w:tc>
@@ -2583,7 +2711,7 @@
               <w:rPr>
                 <w:sz w:val="17"/>
               </w:rPr>
-              <w:t>Dat hang COD phai tru ton kho ngay lap tuc tai chi nhanh. Tranh race condition khi 2 nguoi mua dong thoi bong hoa cuoi cung.</w:t>
+              <w:t>Hien thuc day du luong xac thuc JWT tai /api/auth/**: cap Access Token (15 phut) va Refresh Token (7 ngay), ho tro token rotation va revoke khi logout.</w:t>
             </w:r>
           </w:p>
         </w:tc>
@@ -2603,7 +2731,7 @@
               <w:rPr>
                 <w:sz w:val="17"/>
               </w:rPr>
-              <w:t>AI cai dat Pessimistic Write Lock tren StoreInventory trong transaction REPEATABLE_READ va co che reconcileInventoryOnCancel().</w:t>
+              <w:t>AI viet JwtTokenService, entity JwtSession, JwtRefreshToken luu hash va 4 endpoints API chuan REST.</w:t>
             </w:r>
           </w:p>
         </w:tc>
@@ -2627,7 +2755,7 @@
                 <w:color w:val="1B365D"/>
                 <w:sz w:val="17"/>
               </w:rPr>
-              <w:t>Giai doan 4: Vong doi don hang hoa</w:t>
+              <w:t>6. Xac thuc OTP Email</w:t>
             </w:r>
           </w:p>
         </w:tc>
@@ -2647,7 +2775,7 @@
               <w:rPr>
                 <w:sz w:val="17"/>
               </w:rPr>
-              <w:t>Khi cua hang chuyen sang Dang cam hoa (PREPARING), khoa nut huy cua khach. Quan ly huy bat buoc nhap ly do &lt;= 300 ky tu.</w:t>
+              <w:t>Xay dung chuc nang quen mat khau: Khach hang nhap email, he thong gui ma OTP 6 chu so qua Email. Tuyet doi khong in ma OTP ra console log hoac truyen qua URL.</w:t>
             </w:r>
           </w:p>
         </w:tc>
@@ -2667,7 +2795,7 @@
               <w:rPr>
                 <w:sz w:val="17"/>
               </w:rPr>
-              <w:t>AI cap nhat OrderStatus, kiem tra dieu kien tai Backend va tao modal popup xac nhan kem ghi log ly do huy vao CSDL.</w:t>
+              <w:t>AI xay dung OtpService, tich hop JavaMailSender gui email HTML va ma hoa mat khau moi bang BCrypt.</w:t>
             </w:r>
           </w:p>
         </w:tc>
@@ -2691,7 +2819,7 @@
                 <w:color w:val="1B365D"/>
                 <w:sz w:val="17"/>
               </w:rPr>
-              <w:t>Giai doan 5: Realtime Chat &amp; Cloudinary</w:t>
+              <w:t>7. Tim kiem &amp; Bo loc hoa</w:t>
             </w:r>
           </w:p>
         </w:tc>
@@ -2711,7 +2839,7 @@
               <w:rPr>
                 <w:sz w:val="17"/>
               </w:rPr>
-              <w:t>Cau hinh WebSocket STOMP /ws-chat de chat thoi gian thuc theo chi nhanh. Upload anh Cloudinary lay API key tu file .env, khong hardcode.</w:t>
+              <w:t>Xay dung trang chu va trang danh muc hoa tuoi: hien thi banner, danh muc theo dip va bo loc da tieu chi theo chi nhanh con hang, khoang gia, loai hoa, mau sac.</w:t>
             </w:r>
           </w:p>
         </w:tc>
@@ -2731,7 +2859,7 @@
               <w:rPr>
                 <w:sz w:val="17"/>
               </w:rPr>
-              <w:t>AI tao WebSocketConfig, ChatController va CloudinaryService doc tu file bien moi truong an toan.</w:t>
+              <w:t>AI viet ProductController va ProductSpecification ho tro truy van dong Spring Data JPA, hien thi ton kho realtime tren the hoa.</w:t>
             </w:r>
           </w:p>
         </w:tc>
@@ -2755,7 +2883,7 @@
                 <w:color w:val="1B365D"/>
                 <w:sz w:val="17"/>
               </w:rPr>
-              <w:t>Giai doan 6: Tinh chinh giao dien KPI</w:t>
+              <w:t>8. Dat hang &amp; Tru ton kho</w:t>
             </w:r>
           </w:p>
         </w:tc>
@@ -2775,7 +2903,7 @@
               <w:rPr>
                 <w:sz w:val="17"/>
               </w:rPr>
-              <w:t>Cho cac KPIs nay nam cung 1 hang tren Dashboard quan ly.</w:t>
+              <w:t>Dat hang COD phai tru ton kho ngay lap tuc tai chi nhanh. Tranh race condition khi 2 nguoi mua dong thoi bong hoa cuoi cung.</w:t>
             </w:r>
           </w:p>
         </w:tc>
@@ -2795,7 +2923,7 @@
               <w:rPr>
                 <w:sz w:val="17"/>
               </w:rPr>
-              <w:t>AI viet lai CSS Grid va Flexbox responsive tren manager/dashboard.html va admin/dashboard.html.</w:t>
+              <w:t>AI cai dat Pessimistic Write Lock tren StoreInventory trong transaction REPEATABLE_READ va co che hoan kho chinh xac 1 lan.</w:t>
             </w:r>
           </w:p>
         </w:tc>
@@ -2819,7 +2947,7 @@
                 <w:color w:val="1B365D"/>
                 <w:sz w:val="17"/>
               </w:rPr>
-              <w:t>Giai doan 7: Dat lai ten san pham</w:t>
+              <w:t>9. Vong doi don hang hoa</w:t>
             </w:r>
           </w:p>
         </w:tc>
@@ -2839,7 +2967,7 @@
               <w:rPr>
                 <w:sz w:val="17"/>
               </w:rPr>
-              <w:t>Dat lai ten toan bo san pham cua cua hang cho dung va de hieu, khong dat ten tru tuong nhu 'Bo Hoa Huong Duong Anh Duong Rang Ro'.</w:t>
+              <w:t>Khi cua hang chuyen sang Dang cam hoa (PREPARING), khoa nut huy cua khach. Quan ly huy bat buoc nhap ly do &lt;= 300 ky tu.</w:t>
             </w:r>
           </w:p>
         </w:tc>
@@ -2859,7 +2987,7 @@
               <w:rPr>
                 <w:sz w:val="17"/>
               </w:rPr>
-              <w:t>AI viet script cap nhat CSDL doi toan bo ten sang ten thuc te: 'Bo hoa huong duong', 'Bo hoa hong do tuoi'...</w:t>
+              <w:t>AI cap nhat OrderStatus, kiem tra dieu kien tai Backend va tao modal popup xac nhan kem ghi log ly do huy vao CSDL.</w:t>
             </w:r>
           </w:p>
         </w:tc>
@@ -2883,7 +3011,7 @@
                 <w:color w:val="1B365D"/>
                 <w:sz w:val="17"/>
               </w:rPr>
-              <w:t>Giai doan 8: Dropdown chon thuoc tinh</w:t>
+              <w:t>10. Quan ly chi nhanh UC_017-026</w:t>
             </w:r>
           </w:p>
         </w:tc>
@@ -2903,7 +3031,7 @@
               <w:rPr>
                 <w:sz w:val="17"/>
               </w:rPr>
-              <w:t>Loi khi them san pham, toi muon no co nut bam so xuong de co the lua chon thuoc tinh hoa.</w:t>
+              <w:t>Hoan thien day du cac Use Case quan ly chi nhanh tu UC_017 den UC_026: Tao cua hang, ho so cua hang, phan cong nhan vien, quan ly mau hoa, cap nhat ton kho, vi tien va rut tien.</w:t>
             </w:r>
           </w:p>
         </w:tc>
@@ -2923,7 +3051,7 @@
               <w:rPr>
                 <w:sz w:val="17"/>
               </w:rPr>
-              <w:t>AI viet component flower-attributes.html va JS ho tro dropdown so xuong chon nhanh tag Loai hoa, Mau sac, Phong cach, Dip tang.</w:t>
+              <w:t>AI xay dung tron bo controller quan ly chi nhanh, quan ly nhan su, ton kho kho hoa va vi doanh thu kha dung.</w:t>
             </w:r>
           </w:p>
         </w:tc>
@@ -2947,7 +3075,7 @@
                 <w:color w:val="1B365D"/>
                 <w:sz w:val="17"/>
               </w:rPr>
-              <w:t>Giai doan 9: Sua loi upload anh 413</w:t>
+              <w:t>11. Realtime Chat STOMP</w:t>
             </w:r>
           </w:p>
         </w:tc>
@@ -2967,7 +3095,7 @@
               <w:rPr>
                 <w:sz w:val="17"/>
               </w:rPr>
-              <w:t>Khi them san pham bi loi 413 FileCountLimitExceededException.</w:t>
+              <w:t>Cau hinh WebSocket STOMP /ws-chat de chat thoi gian thuc theo chi nhanh. Tin nhan gui tuc thi khong can tai lai trang.</w:t>
             </w:r>
           </w:p>
         </w:tc>
@@ -2987,7 +3115,7 @@
               <w:rPr>
                 <w:sz w:val="17"/>
               </w:rPr>
-              <w:t>AI toi uu hoa multipart resolver, loai bo cac input file trung lap, cho phep upload anh on dinh.</w:t>
+              <w:t>AI tao WebSocketConfig, ChatController, phan luong tin nhan qua /topic/messages.{chatSessionId} va thong bao cho shop.</w:t>
             </w:r>
           </w:p>
         </w:tc>
@@ -3011,7 +3139,7 @@
                 <w:color w:val="1B365D"/>
                 <w:sz w:val="17"/>
               </w:rPr>
-              <w:t>Giai doan 10: Bao toan thuoc tinh cu</w:t>
+              <w:t>12. Luu tru Media Cloudinary</w:t>
             </w:r>
           </w:p>
         </w:tc>
@@ -3031,7 +3159,7 @@
               <w:rPr>
                 <w:sz w:val="17"/>
               </w:rPr>
-              <w:t>Ban giup toi, sau khi toi sua cac thuoc tinh thi cac thuoc tinh cu cua toi bi mat di.</w:t>
+              <w:t>Tich hop Cloudinary de tai len anh san pham hoa tuoi, avatar, chat. Khong luu cung API Key va Secret trong code; tu dong doc tu .env.</w:t>
             </w:r>
           </w:p>
         </w:tc>
@@ -3051,7 +3179,7 @@
               <w:rPr>
                 <w:sz w:val="17"/>
               </w:rPr>
-              <w:t>AI phan tich lech alias 'Phong cach' vs 'Phong cach thiet ke', sua ProductAttributeService giu nguyen gia tri cu va them getSelectedStyleValueIds().</w:t>
+              <w:t>AI tao CloudinaryService nap bien moi truong an toan, ham uploadImage() tra ve secure_url va public_id.</w:t>
             </w:r>
           </w:p>
         </w:tc>
@@ -3075,7 +3203,7 @@
                 <w:color w:val="1B365D"/>
                 <w:sz w:val="17"/>
               </w:rPr>
-              <w:t>Giai doan 11: Don dep du an &amp; Sinh hinh</w:t>
+              <w:t>13. Quan tri Admin toan chuoi</w:t>
             </w:r>
           </w:p>
         </w:tc>
@@ -3095,7 +3223,7 @@
               <w:rPr>
                 <w:sz w:val="17"/>
               </w:rPr>
-              <w:t>Xoa toan bo cac file khong can den trong du an va tu dong tao trong qua trinh bien dich. Sinh hinh so do kien truc cho bao cao.</w:t>
+              <w:t>Xay dung trang Dashboard Admin quan ly toan chuoi: duyet/khoa chi nhanh, quan ly danh muc hoa, don vi giao hang va bieu phi van chuyen vung.</w:t>
             </w:r>
           </w:p>
         </w:tc>
@@ -3115,7 +3243,71 @@
               <w:rPr>
                 <w:sz w:val="17"/>
               </w:rPr>
-              <w:t>AI chay mvn clean xoa target/, xoa .tmp/, viet script Python sinh 5 so do kien truc chat luong cao va tao file bao cao .docx nay.</w:t>
+              <w:t>AI tach cac controller quan tri chuyen biet, bao ve tai khoan ROLE_ADMIN va cai dat bieu phi van chuyen linh hoat.</w:t>
+            </w:r>
+          </w:p>
+        </w:tc>
+      </w:tr>
+      <w:tr>
+        <w:tc>
+          <w:tcPr>
+            <w:tcW w:type="dxa" w:w="2160"/>
+            <w:shd w:fill="F8F9FA"/>
+            <w:tcMar>
+              <w:top w:w="50" w:type="dxa"/>
+              <w:bottom w:w="50" w:type="dxa"/>
+              <w:left w:w="80" w:type="dxa"/>
+              <w:right w:w="80" w:type="dxa"/>
+            </w:tcMar>
+          </w:tcPr>
+          <w:p>
+            <w:r>
+              <w:rPr>
+                <w:b/>
+                <w:color w:val="1B365D"/>
+                <w:sz w:val="17"/>
+              </w:rPr>
+              <w:t>14. Kiem thu tu dong (540+ Tests)</w:t>
+            </w:r>
+          </w:p>
+        </w:tc>
+        <w:tc>
+          <w:tcPr>
+            <w:tcW w:type="dxa" w:w="3600"/>
+            <w:shd w:fill="F8F9FA"/>
+            <w:tcMar>
+              <w:top w:w="50" w:type="dxa"/>
+              <w:bottom w:w="50" w:type="dxa"/>
+              <w:left w:w="80" w:type="dxa"/>
+              <w:right w:w="80" w:type="dxa"/>
+            </w:tcMar>
+          </w:tcPr>
+          <w:p>
+            <w:r>
+              <w:rPr>
+                <w:sz w:val="17"/>
+              </w:rPr>
+              <w:t>Viet bo kiem thu tu dong (JUnit 5 + Mockito + SpringBootTest) kiem tra toan bo luong nghiep vu: bao mat JWT, gio hang, hoan kho va 20 luong dong thoi.</w:t>
+            </w:r>
+          </w:p>
+        </w:tc>
+        <w:tc>
+          <w:tcPr>
+            <w:tcW w:type="dxa" w:w="3600"/>
+            <w:shd w:fill="F8F9FA"/>
+            <w:tcMar>
+              <w:top w:w="50" w:type="dxa"/>
+              <w:bottom w:w="50" w:type="dxa"/>
+              <w:left w:w="80" w:type="dxa"/>
+              <w:right w:w="80" w:type="dxa"/>
+            </w:tcMar>
+          </w:tcPr>
+          <w:p>
+            <w:r>
+              <w:rPr>
+                <w:sz w:val="17"/>
+              </w:rPr>
+              <w:t>AI xay dung hon 540 ca kiem thu tu dong trong src/test/java/com/finalproject/, ket qua 547 ca test dat (BUILD SUCCESS).</w:t>
             </w:r>
           </w:p>
         </w:tc>

</xml_diff>